<commit_message>
Report: explain the Holt-Winters forecasting equations
Numbers the four equations (3.1)-(3.4) and sets them with real Word
subscripts instead of Unicode subscript characters, which printed unevenly
and broke when copied. Adds what each symbol means, what each equation does,
how the model starts and how alpha, beta and gamma are chosen, and a worked
example (a Saturday's biscuit sales to next Saturday's forecast). Both the
full and the first-review reports are rebuilt.

Co-Authored-By: Claude Opus 5.5 <noreply@anthropic.com>
Claude-Session: https://claude.ai/code/session_01F1FCRnDHrNjivdPNRTQgPE
</commit_message>
<xml_diff>
--- a/docs/report/First_Review_Report.docx
+++ b/docs/report/First_Review_Report.docx
@@ -4325,7 +4325,7 @@
                 <w:sz w:val="23"/>
                 <w:szCs w:val="23"/>
               </w:rPr>
-              <w:t xml:space="preserve">14</w:t>
+              <w:t xml:space="preserve">15</w:t>
             </w:r>
           </w:p>
         </w:tc>
@@ -7629,66 +7629,932 @@
     </w:p>
     <w:p>
       <w:pPr>
-        <w:spacing w:after="80" w:line="300"/>
-        <w:jc w:val="center"/>
-      </w:pPr>
-      <w:r>
-        <w:rPr>
-          <w:rFonts w:ascii="Times New Roman" w:cs="Times New Roman" w:eastAsia="Times New Roman" w:hAnsi="Times New Roman"/>
-          <w:i/>
-          <w:iCs/>
-          <w:sz w:val="24"/>
-          <w:szCs w:val="24"/>
-        </w:rPr>
-        <w:t xml:space="preserve">ℓₜ = α (yₜ − sₜ₋ₘ) + (1 − α)(ℓₜ₋₁ + bₜ₋₁)</w:t>
-      </w:r>
-    </w:p>
-    <w:p>
-      <w:pPr>
-        <w:spacing w:after="80" w:line="300"/>
-        <w:jc w:val="center"/>
-      </w:pPr>
-      <w:r>
-        <w:rPr>
-          <w:rFonts w:ascii="Times New Roman" w:cs="Times New Roman" w:eastAsia="Times New Roman" w:hAnsi="Times New Roman"/>
-          <w:i/>
-          <w:iCs/>
-          <w:sz w:val="24"/>
-          <w:szCs w:val="24"/>
-        </w:rPr>
-        <w:t xml:space="preserve">bₜ = β (ℓₜ − ℓₜ₋₁) + (1 − β) bₜ₋₁</w:t>
-      </w:r>
-    </w:p>
-    <w:p>
-      <w:pPr>
-        <w:spacing w:after="80" w:line="300"/>
-        <w:jc w:val="center"/>
-      </w:pPr>
-      <w:r>
-        <w:rPr>
-          <w:rFonts w:ascii="Times New Roman" w:cs="Times New Roman" w:eastAsia="Times New Roman" w:hAnsi="Times New Roman"/>
-          <w:i/>
-          <w:iCs/>
-          <w:sz w:val="24"/>
-          <w:szCs w:val="24"/>
-        </w:rPr>
-        <w:t xml:space="preserve">sₜ = γ (yₜ − ℓₜ) + (1 − γ) sₜ₋ₘ</w:t>
-      </w:r>
-    </w:p>
-    <w:p>
-      <w:pPr>
-        <w:spacing w:after="80" w:line="300"/>
-        <w:jc w:val="center"/>
-      </w:pPr>
-      <w:r>
-        <w:rPr>
-          <w:rFonts w:ascii="Times New Roman" w:cs="Times New Roman" w:eastAsia="Times New Roman" w:hAnsi="Times New Roman"/>
-          <w:i/>
-          <w:iCs/>
-          <w:sz w:val="24"/>
-          <w:szCs w:val="24"/>
-        </w:rPr>
-        <w:t xml:space="preserve">ŷₜ₊ₕ = ℓₜ + h·bₜ + sₜ₊ₕ₋ₘ</w:t>
+        <w:tabs>
+          <w:tab w:val="center" w:pos="4423"/>
+          <w:tab w:val="right" w:pos="8846"/>
+        </w:tabs>
+        <w:spacing w:after="100" w:line="300"/>
+      </w:pPr>
+      <w:r>
+        <w:rPr>
+          <w:rFonts w:ascii="Times New Roman" w:cs="Times New Roman" w:eastAsia="Times New Roman" w:hAnsi="Times New Roman"/>
+          <w:sz w:val="24"/>
+          <w:szCs w:val="24"/>
+        </w:rPr>
+        <w:t xml:space="preserve">	</w:t>
+      </w:r>
+      <w:r>
+        <w:rPr>
+          <w:rFonts w:ascii="Times New Roman" w:cs="Times New Roman" w:eastAsia="Times New Roman" w:hAnsi="Times New Roman"/>
+          <w:i/>
+          <w:iCs/>
+          <w:sz w:val="24"/>
+          <w:szCs w:val="24"/>
+        </w:rPr>
+        <w:t xml:space="preserve">ℓ</w:t>
+      </w:r>
+      <w:r>
+        <w:rPr>
+          <w:rFonts w:ascii="Times New Roman" w:cs="Times New Roman" w:eastAsia="Times New Roman" w:hAnsi="Times New Roman"/>
+          <w:i/>
+          <w:iCs/>
+          <w:sz w:val="24"/>
+          <w:szCs w:val="24"/>
+          <w:vertAlign w:val="subscript"/>
+        </w:rPr>
+        <w:t xml:space="preserve">t</w:t>
+      </w:r>
+      <w:r>
+        <w:rPr>
+          <w:rFonts w:ascii="Times New Roman" w:cs="Times New Roman" w:eastAsia="Times New Roman" w:hAnsi="Times New Roman"/>
+          <w:i/>
+          <w:iCs/>
+          <w:sz w:val="24"/>
+          <w:szCs w:val="24"/>
+        </w:rPr>
+        <w:t xml:space="preserve"> = α (y</w:t>
+      </w:r>
+      <w:r>
+        <w:rPr>
+          <w:rFonts w:ascii="Times New Roman" w:cs="Times New Roman" w:eastAsia="Times New Roman" w:hAnsi="Times New Roman"/>
+          <w:i/>
+          <w:iCs/>
+          <w:sz w:val="24"/>
+          <w:szCs w:val="24"/>
+          <w:vertAlign w:val="subscript"/>
+        </w:rPr>
+        <w:t xml:space="preserve">t</w:t>
+      </w:r>
+      <w:r>
+        <w:rPr>
+          <w:rFonts w:ascii="Times New Roman" w:cs="Times New Roman" w:eastAsia="Times New Roman" w:hAnsi="Times New Roman"/>
+          <w:i/>
+          <w:iCs/>
+          <w:sz w:val="24"/>
+          <w:szCs w:val="24"/>
+        </w:rPr>
+        <w:t xml:space="preserve"> − s</w:t>
+      </w:r>
+      <w:r>
+        <w:rPr>
+          <w:rFonts w:ascii="Times New Roman" w:cs="Times New Roman" w:eastAsia="Times New Roman" w:hAnsi="Times New Roman"/>
+          <w:i/>
+          <w:iCs/>
+          <w:sz w:val="24"/>
+          <w:szCs w:val="24"/>
+          <w:vertAlign w:val="subscript"/>
+        </w:rPr>
+        <w:t xml:space="preserve">t−m</w:t>
+      </w:r>
+      <w:r>
+        <w:rPr>
+          <w:rFonts w:ascii="Times New Roman" w:cs="Times New Roman" w:eastAsia="Times New Roman" w:hAnsi="Times New Roman"/>
+          <w:i/>
+          <w:iCs/>
+          <w:sz w:val="24"/>
+          <w:szCs w:val="24"/>
+        </w:rPr>
+        <w:t xml:space="preserve">) + (1 − α)(ℓ</w:t>
+      </w:r>
+      <w:r>
+        <w:rPr>
+          <w:rFonts w:ascii="Times New Roman" w:cs="Times New Roman" w:eastAsia="Times New Roman" w:hAnsi="Times New Roman"/>
+          <w:i/>
+          <w:iCs/>
+          <w:sz w:val="24"/>
+          <w:szCs w:val="24"/>
+          <w:vertAlign w:val="subscript"/>
+        </w:rPr>
+        <w:t xml:space="preserve">t−1</w:t>
+      </w:r>
+      <w:r>
+        <w:rPr>
+          <w:rFonts w:ascii="Times New Roman" w:cs="Times New Roman" w:eastAsia="Times New Roman" w:hAnsi="Times New Roman"/>
+          <w:i/>
+          <w:iCs/>
+          <w:sz w:val="24"/>
+          <w:szCs w:val="24"/>
+        </w:rPr>
+        <w:t xml:space="preserve"> + b</w:t>
+      </w:r>
+      <w:r>
+        <w:rPr>
+          <w:rFonts w:ascii="Times New Roman" w:cs="Times New Roman" w:eastAsia="Times New Roman" w:hAnsi="Times New Roman"/>
+          <w:i/>
+          <w:iCs/>
+          <w:sz w:val="24"/>
+          <w:szCs w:val="24"/>
+          <w:vertAlign w:val="subscript"/>
+        </w:rPr>
+        <w:t xml:space="preserve">t−1</w:t>
+      </w:r>
+      <w:r>
+        <w:rPr>
+          <w:rFonts w:ascii="Times New Roman" w:cs="Times New Roman" w:eastAsia="Times New Roman" w:hAnsi="Times New Roman"/>
+          <w:i/>
+          <w:iCs/>
+          <w:sz w:val="24"/>
+          <w:szCs w:val="24"/>
+        </w:rPr>
+        <w:t xml:space="preserve">)</w:t>
+      </w:r>
+      <w:r>
+        <w:rPr>
+          <w:rFonts w:ascii="Times New Roman" w:cs="Times New Roman" w:eastAsia="Times New Roman" w:hAnsi="Times New Roman"/>
+          <w:sz w:val="24"/>
+          <w:szCs w:val="24"/>
+        </w:rPr>
+        <w:t xml:space="preserve">	(3.1)</w:t>
+      </w:r>
+    </w:p>
+    <w:p>
+      <w:pPr>
+        <w:tabs>
+          <w:tab w:val="center" w:pos="4423"/>
+          <w:tab w:val="right" w:pos="8846"/>
+        </w:tabs>
+        <w:spacing w:after="100" w:line="300"/>
+      </w:pPr>
+      <w:r>
+        <w:rPr>
+          <w:rFonts w:ascii="Times New Roman" w:cs="Times New Roman" w:eastAsia="Times New Roman" w:hAnsi="Times New Roman"/>
+          <w:sz w:val="24"/>
+          <w:szCs w:val="24"/>
+        </w:rPr>
+        <w:t xml:space="preserve">	</w:t>
+      </w:r>
+      <w:r>
+        <w:rPr>
+          <w:rFonts w:ascii="Times New Roman" w:cs="Times New Roman" w:eastAsia="Times New Roman" w:hAnsi="Times New Roman"/>
+          <w:i/>
+          <w:iCs/>
+          <w:sz w:val="24"/>
+          <w:szCs w:val="24"/>
+        </w:rPr>
+        <w:t xml:space="preserve">b</w:t>
+      </w:r>
+      <w:r>
+        <w:rPr>
+          <w:rFonts w:ascii="Times New Roman" w:cs="Times New Roman" w:eastAsia="Times New Roman" w:hAnsi="Times New Roman"/>
+          <w:i/>
+          <w:iCs/>
+          <w:sz w:val="24"/>
+          <w:szCs w:val="24"/>
+          <w:vertAlign w:val="subscript"/>
+        </w:rPr>
+        <w:t xml:space="preserve">t</w:t>
+      </w:r>
+      <w:r>
+        <w:rPr>
+          <w:rFonts w:ascii="Times New Roman" w:cs="Times New Roman" w:eastAsia="Times New Roman" w:hAnsi="Times New Roman"/>
+          <w:i/>
+          <w:iCs/>
+          <w:sz w:val="24"/>
+          <w:szCs w:val="24"/>
+        </w:rPr>
+        <w:t xml:space="preserve"> = β (ℓ</w:t>
+      </w:r>
+      <w:r>
+        <w:rPr>
+          <w:rFonts w:ascii="Times New Roman" w:cs="Times New Roman" w:eastAsia="Times New Roman" w:hAnsi="Times New Roman"/>
+          <w:i/>
+          <w:iCs/>
+          <w:sz w:val="24"/>
+          <w:szCs w:val="24"/>
+          <w:vertAlign w:val="subscript"/>
+        </w:rPr>
+        <w:t xml:space="preserve">t</w:t>
+      </w:r>
+      <w:r>
+        <w:rPr>
+          <w:rFonts w:ascii="Times New Roman" w:cs="Times New Roman" w:eastAsia="Times New Roman" w:hAnsi="Times New Roman"/>
+          <w:i/>
+          <w:iCs/>
+          <w:sz w:val="24"/>
+          <w:szCs w:val="24"/>
+        </w:rPr>
+        <w:t xml:space="preserve"> − ℓ</w:t>
+      </w:r>
+      <w:r>
+        <w:rPr>
+          <w:rFonts w:ascii="Times New Roman" w:cs="Times New Roman" w:eastAsia="Times New Roman" w:hAnsi="Times New Roman"/>
+          <w:i/>
+          <w:iCs/>
+          <w:sz w:val="24"/>
+          <w:szCs w:val="24"/>
+          <w:vertAlign w:val="subscript"/>
+        </w:rPr>
+        <w:t xml:space="preserve">t−1</w:t>
+      </w:r>
+      <w:r>
+        <w:rPr>
+          <w:rFonts w:ascii="Times New Roman" w:cs="Times New Roman" w:eastAsia="Times New Roman" w:hAnsi="Times New Roman"/>
+          <w:i/>
+          <w:iCs/>
+          <w:sz w:val="24"/>
+          <w:szCs w:val="24"/>
+        </w:rPr>
+        <w:t xml:space="preserve">) + (1 − β) b</w:t>
+      </w:r>
+      <w:r>
+        <w:rPr>
+          <w:rFonts w:ascii="Times New Roman" w:cs="Times New Roman" w:eastAsia="Times New Roman" w:hAnsi="Times New Roman"/>
+          <w:i/>
+          <w:iCs/>
+          <w:sz w:val="24"/>
+          <w:szCs w:val="24"/>
+          <w:vertAlign w:val="subscript"/>
+        </w:rPr>
+        <w:t xml:space="preserve">t−1</w:t>
+      </w:r>
+      <w:r>
+        <w:rPr>
+          <w:rFonts w:ascii="Times New Roman" w:cs="Times New Roman" w:eastAsia="Times New Roman" w:hAnsi="Times New Roman"/>
+          <w:sz w:val="24"/>
+          <w:szCs w:val="24"/>
+        </w:rPr>
+        <w:t xml:space="preserve">	(3.2)</w:t>
+      </w:r>
+    </w:p>
+    <w:p>
+      <w:pPr>
+        <w:tabs>
+          <w:tab w:val="center" w:pos="4423"/>
+          <w:tab w:val="right" w:pos="8846"/>
+        </w:tabs>
+        <w:spacing w:after="100" w:line="300"/>
+      </w:pPr>
+      <w:r>
+        <w:rPr>
+          <w:rFonts w:ascii="Times New Roman" w:cs="Times New Roman" w:eastAsia="Times New Roman" w:hAnsi="Times New Roman"/>
+          <w:sz w:val="24"/>
+          <w:szCs w:val="24"/>
+        </w:rPr>
+        <w:t xml:space="preserve">	</w:t>
+      </w:r>
+      <w:r>
+        <w:rPr>
+          <w:rFonts w:ascii="Times New Roman" w:cs="Times New Roman" w:eastAsia="Times New Roman" w:hAnsi="Times New Roman"/>
+          <w:i/>
+          <w:iCs/>
+          <w:sz w:val="24"/>
+          <w:szCs w:val="24"/>
+        </w:rPr>
+        <w:t xml:space="preserve">s</w:t>
+      </w:r>
+      <w:r>
+        <w:rPr>
+          <w:rFonts w:ascii="Times New Roman" w:cs="Times New Roman" w:eastAsia="Times New Roman" w:hAnsi="Times New Roman"/>
+          <w:i/>
+          <w:iCs/>
+          <w:sz w:val="24"/>
+          <w:szCs w:val="24"/>
+          <w:vertAlign w:val="subscript"/>
+        </w:rPr>
+        <w:t xml:space="preserve">t</w:t>
+      </w:r>
+      <w:r>
+        <w:rPr>
+          <w:rFonts w:ascii="Times New Roman" w:cs="Times New Roman" w:eastAsia="Times New Roman" w:hAnsi="Times New Roman"/>
+          <w:i/>
+          <w:iCs/>
+          <w:sz w:val="24"/>
+          <w:szCs w:val="24"/>
+        </w:rPr>
+        <w:t xml:space="preserve"> = γ (y</w:t>
+      </w:r>
+      <w:r>
+        <w:rPr>
+          <w:rFonts w:ascii="Times New Roman" w:cs="Times New Roman" w:eastAsia="Times New Roman" w:hAnsi="Times New Roman"/>
+          <w:i/>
+          <w:iCs/>
+          <w:sz w:val="24"/>
+          <w:szCs w:val="24"/>
+          <w:vertAlign w:val="subscript"/>
+        </w:rPr>
+        <w:t xml:space="preserve">t</w:t>
+      </w:r>
+      <w:r>
+        <w:rPr>
+          <w:rFonts w:ascii="Times New Roman" w:cs="Times New Roman" w:eastAsia="Times New Roman" w:hAnsi="Times New Roman"/>
+          <w:i/>
+          <w:iCs/>
+          <w:sz w:val="24"/>
+          <w:szCs w:val="24"/>
+        </w:rPr>
+        <w:t xml:space="preserve"> − ℓ</w:t>
+      </w:r>
+      <w:r>
+        <w:rPr>
+          <w:rFonts w:ascii="Times New Roman" w:cs="Times New Roman" w:eastAsia="Times New Roman" w:hAnsi="Times New Roman"/>
+          <w:i/>
+          <w:iCs/>
+          <w:sz w:val="24"/>
+          <w:szCs w:val="24"/>
+          <w:vertAlign w:val="subscript"/>
+        </w:rPr>
+        <w:t xml:space="preserve">t</w:t>
+      </w:r>
+      <w:r>
+        <w:rPr>
+          <w:rFonts w:ascii="Times New Roman" w:cs="Times New Roman" w:eastAsia="Times New Roman" w:hAnsi="Times New Roman"/>
+          <w:i/>
+          <w:iCs/>
+          <w:sz w:val="24"/>
+          <w:szCs w:val="24"/>
+        </w:rPr>
+        <w:t xml:space="preserve">) + (1 − γ) s</w:t>
+      </w:r>
+      <w:r>
+        <w:rPr>
+          <w:rFonts w:ascii="Times New Roman" w:cs="Times New Roman" w:eastAsia="Times New Roman" w:hAnsi="Times New Roman"/>
+          <w:i/>
+          <w:iCs/>
+          <w:sz w:val="24"/>
+          <w:szCs w:val="24"/>
+          <w:vertAlign w:val="subscript"/>
+        </w:rPr>
+        <w:t xml:space="preserve">t−m</w:t>
+      </w:r>
+      <w:r>
+        <w:rPr>
+          <w:rFonts w:ascii="Times New Roman" w:cs="Times New Roman" w:eastAsia="Times New Roman" w:hAnsi="Times New Roman"/>
+          <w:sz w:val="24"/>
+          <w:szCs w:val="24"/>
+        </w:rPr>
+        <w:t xml:space="preserve">	(3.3)</w:t>
+      </w:r>
+    </w:p>
+    <w:p>
+      <w:pPr>
+        <w:tabs>
+          <w:tab w:val="center" w:pos="4423"/>
+          <w:tab w:val="right" w:pos="8846"/>
+        </w:tabs>
+        <w:spacing w:after="100" w:line="300"/>
+      </w:pPr>
+      <w:r>
+        <w:rPr>
+          <w:rFonts w:ascii="Times New Roman" w:cs="Times New Roman" w:eastAsia="Times New Roman" w:hAnsi="Times New Roman"/>
+          <w:sz w:val="24"/>
+          <w:szCs w:val="24"/>
+        </w:rPr>
+        <w:t xml:space="preserve">	</w:t>
+      </w:r>
+      <w:r>
+        <w:rPr>
+          <w:rFonts w:ascii="Times New Roman" w:cs="Times New Roman" w:eastAsia="Times New Roman" w:hAnsi="Times New Roman"/>
+          <w:i/>
+          <w:iCs/>
+          <w:sz w:val="24"/>
+          <w:szCs w:val="24"/>
+        </w:rPr>
+        <w:t xml:space="preserve">ŷ</w:t>
+      </w:r>
+      <w:r>
+        <w:rPr>
+          <w:rFonts w:ascii="Times New Roman" w:cs="Times New Roman" w:eastAsia="Times New Roman" w:hAnsi="Times New Roman"/>
+          <w:i/>
+          <w:iCs/>
+          <w:sz w:val="24"/>
+          <w:szCs w:val="24"/>
+          <w:vertAlign w:val="subscript"/>
+        </w:rPr>
+        <w:t xml:space="preserve">t+h</w:t>
+      </w:r>
+      <w:r>
+        <w:rPr>
+          <w:rFonts w:ascii="Times New Roman" w:cs="Times New Roman" w:eastAsia="Times New Roman" w:hAnsi="Times New Roman"/>
+          <w:i/>
+          <w:iCs/>
+          <w:sz w:val="24"/>
+          <w:szCs w:val="24"/>
+        </w:rPr>
+        <w:t xml:space="preserve"> = ℓ</w:t>
+      </w:r>
+      <w:r>
+        <w:rPr>
+          <w:rFonts w:ascii="Times New Roman" w:cs="Times New Roman" w:eastAsia="Times New Roman" w:hAnsi="Times New Roman"/>
+          <w:i/>
+          <w:iCs/>
+          <w:sz w:val="24"/>
+          <w:szCs w:val="24"/>
+          <w:vertAlign w:val="subscript"/>
+        </w:rPr>
+        <w:t xml:space="preserve">t</w:t>
+      </w:r>
+      <w:r>
+        <w:rPr>
+          <w:rFonts w:ascii="Times New Roman" w:cs="Times New Roman" w:eastAsia="Times New Roman" w:hAnsi="Times New Roman"/>
+          <w:i/>
+          <w:iCs/>
+          <w:sz w:val="24"/>
+          <w:szCs w:val="24"/>
+        </w:rPr>
+        <w:t xml:space="preserve"> + h · b</w:t>
+      </w:r>
+      <w:r>
+        <w:rPr>
+          <w:rFonts w:ascii="Times New Roman" w:cs="Times New Roman" w:eastAsia="Times New Roman" w:hAnsi="Times New Roman"/>
+          <w:i/>
+          <w:iCs/>
+          <w:sz w:val="24"/>
+          <w:szCs w:val="24"/>
+          <w:vertAlign w:val="subscript"/>
+        </w:rPr>
+        <w:t xml:space="preserve">t</w:t>
+      </w:r>
+      <w:r>
+        <w:rPr>
+          <w:rFonts w:ascii="Times New Roman" w:cs="Times New Roman" w:eastAsia="Times New Roman" w:hAnsi="Times New Roman"/>
+          <w:i/>
+          <w:iCs/>
+          <w:sz w:val="24"/>
+          <w:szCs w:val="24"/>
+        </w:rPr>
+        <w:t xml:space="preserve"> + s</w:t>
+      </w:r>
+      <w:r>
+        <w:rPr>
+          <w:rFonts w:ascii="Times New Roman" w:cs="Times New Roman" w:eastAsia="Times New Roman" w:hAnsi="Times New Roman"/>
+          <w:i/>
+          <w:iCs/>
+          <w:sz w:val="24"/>
+          <w:szCs w:val="24"/>
+          <w:vertAlign w:val="subscript"/>
+        </w:rPr>
+        <w:t xml:space="preserve">t+h−m</w:t>
+      </w:r>
+      <w:r>
+        <w:rPr>
+          <w:rFonts w:ascii="Times New Roman" w:cs="Times New Roman" w:eastAsia="Times New Roman" w:hAnsi="Times New Roman"/>
+          <w:sz w:val="24"/>
+          <w:szCs w:val="24"/>
+        </w:rPr>
+        <w:t xml:space="preserve">	(3.4)</w:t>
+      </w:r>
+    </w:p>
+    <w:p>
+      <w:pPr>
+        <w:spacing w:after="140" w:before="0" w:line="360"/>
+        <w:jc w:val="both"/>
+      </w:pPr>
+      <w:r>
+        <w:rPr>
+          <w:rFonts w:ascii="Times New Roman" w:cs="Times New Roman" w:eastAsia="Times New Roman" w:hAnsi="Times New Roman"/>
+          <w:sz w:val="24"/>
+          <w:szCs w:val="24"/>
+        </w:rPr>
+        <w:t xml:space="preserve">where:</w:t>
+      </w:r>
+    </w:p>
+    <w:p>
+      <w:pPr>
+        <w:pStyle w:val="ListParagraph"/>
+        <w:numPr>
+          <w:ilvl w:val="0"/>
+          <w:numId w:val="5"/>
+        </w:numPr>
+        <w:spacing w:after="80" w:line="360"/>
+        <w:jc w:val="both"/>
+      </w:pPr>
+      <w:r>
+        <w:rPr>
+          <w:rFonts w:ascii="Times New Roman" w:cs="Times New Roman" w:eastAsia="Times New Roman" w:hAnsi="Times New Roman"/>
+          <w:i/>
+          <w:iCs/>
+          <w:sz w:val="24"/>
+          <w:szCs w:val="24"/>
+        </w:rPr>
+        <w:t xml:space="preserve">y</w:t>
+      </w:r>
+      <w:r>
+        <w:rPr>
+          <w:rFonts w:ascii="Times New Roman" w:cs="Times New Roman" w:eastAsia="Times New Roman" w:hAnsi="Times New Roman"/>
+          <w:i/>
+          <w:iCs/>
+          <w:sz w:val="24"/>
+          <w:szCs w:val="24"/>
+          <w:vertAlign w:val="subscript"/>
+        </w:rPr>
+        <w:t xml:space="preserve">t</w:t>
+      </w:r>
+      <w:r>
+        <w:rPr>
+          <w:rFonts w:ascii="Times New Roman" w:cs="Times New Roman" w:eastAsia="Times New Roman" w:hAnsi="Times New Roman"/>
+          <w:sz w:val="24"/>
+          <w:szCs w:val="24"/>
+        </w:rPr>
+        <w:t xml:space="preserve"> is the number of units of the product actually sold on day </w:t>
+      </w:r>
+      <w:r>
+        <w:rPr>
+          <w:rFonts w:ascii="Times New Roman" w:cs="Times New Roman" w:eastAsia="Times New Roman" w:hAnsi="Times New Roman"/>
+          <w:i/>
+          <w:iCs/>
+          <w:sz w:val="24"/>
+          <w:szCs w:val="24"/>
+        </w:rPr>
+        <w:t xml:space="preserve">t</w:t>
+      </w:r>
+      <w:r>
+        <w:rPr>
+          <w:rFonts w:ascii="Times New Roman" w:cs="Times New Roman" w:eastAsia="Times New Roman" w:hAnsi="Times New Roman"/>
+          <w:sz w:val="24"/>
+          <w:szCs w:val="24"/>
+        </w:rPr>
+        <w:t xml:space="preserve">.</w:t>
+      </w:r>
+    </w:p>
+    <w:p>
+      <w:pPr>
+        <w:pStyle w:val="ListParagraph"/>
+        <w:numPr>
+          <w:ilvl w:val="0"/>
+          <w:numId w:val="5"/>
+        </w:numPr>
+        <w:spacing w:after="80" w:line="360"/>
+        <w:jc w:val="both"/>
+      </w:pPr>
+      <w:r>
+        <w:rPr>
+          <w:rFonts w:ascii="Times New Roman" w:cs="Times New Roman" w:eastAsia="Times New Roman" w:hAnsi="Times New Roman"/>
+          <w:i/>
+          <w:iCs/>
+          <w:sz w:val="24"/>
+          <w:szCs w:val="24"/>
+        </w:rPr>
+        <w:t xml:space="preserve">ℓ</w:t>
+      </w:r>
+      <w:r>
+        <w:rPr>
+          <w:rFonts w:ascii="Times New Roman" w:cs="Times New Roman" w:eastAsia="Times New Roman" w:hAnsi="Times New Roman"/>
+          <w:i/>
+          <w:iCs/>
+          <w:sz w:val="24"/>
+          <w:szCs w:val="24"/>
+          <w:vertAlign w:val="subscript"/>
+        </w:rPr>
+        <w:t xml:space="preserve">t</w:t>
+      </w:r>
+      <w:r>
+        <w:rPr>
+          <w:rFonts w:ascii="Times New Roman" w:cs="Times New Roman" w:eastAsia="Times New Roman" w:hAnsi="Times New Roman"/>
+          <w:sz w:val="24"/>
+          <w:szCs w:val="24"/>
+        </w:rPr>
+        <w:t xml:space="preserve"> (</w:t>
+      </w:r>
+      <w:r>
+        <w:rPr>
+          <w:rFonts w:ascii="Times New Roman" w:cs="Times New Roman" w:eastAsia="Times New Roman" w:hAnsi="Times New Roman"/>
+          <w:b/>
+          <w:bCs/>
+          <w:sz w:val="24"/>
+          <w:szCs w:val="24"/>
+        </w:rPr>
+        <w:t xml:space="preserve">level</w:t>
+      </w:r>
+      <w:r>
+        <w:rPr>
+          <w:rFonts w:ascii="Times New Roman" w:cs="Times New Roman" w:eastAsia="Times New Roman" w:hAnsi="Times New Roman"/>
+          <w:sz w:val="24"/>
+          <w:szCs w:val="24"/>
+        </w:rPr>
+        <w:t xml:space="preserve">) is the product's normal daily sales with the day-of-the-week effect taken out, as estimated on day </w:t>
+      </w:r>
+      <w:r>
+        <w:rPr>
+          <w:rFonts w:ascii="Times New Roman" w:cs="Times New Roman" w:eastAsia="Times New Roman" w:hAnsi="Times New Roman"/>
+          <w:i/>
+          <w:iCs/>
+          <w:sz w:val="24"/>
+          <w:szCs w:val="24"/>
+        </w:rPr>
+        <w:t xml:space="preserve">t</w:t>
+      </w:r>
+      <w:r>
+        <w:rPr>
+          <w:rFonts w:ascii="Times New Roman" w:cs="Times New Roman" w:eastAsia="Times New Roman" w:hAnsi="Times New Roman"/>
+          <w:sz w:val="24"/>
+          <w:szCs w:val="24"/>
+        </w:rPr>
+        <w:t xml:space="preserve">.</w:t>
+      </w:r>
+    </w:p>
+    <w:p>
+      <w:pPr>
+        <w:pStyle w:val="ListParagraph"/>
+        <w:numPr>
+          <w:ilvl w:val="0"/>
+          <w:numId w:val="5"/>
+        </w:numPr>
+        <w:spacing w:after="80" w:line="360"/>
+        <w:jc w:val="both"/>
+      </w:pPr>
+      <w:r>
+        <w:rPr>
+          <w:rFonts w:ascii="Times New Roman" w:cs="Times New Roman" w:eastAsia="Times New Roman" w:hAnsi="Times New Roman"/>
+          <w:i/>
+          <w:iCs/>
+          <w:sz w:val="24"/>
+          <w:szCs w:val="24"/>
+        </w:rPr>
+        <w:t xml:space="preserve">b</w:t>
+      </w:r>
+      <w:r>
+        <w:rPr>
+          <w:rFonts w:ascii="Times New Roman" w:cs="Times New Roman" w:eastAsia="Times New Roman" w:hAnsi="Times New Roman"/>
+          <w:i/>
+          <w:iCs/>
+          <w:sz w:val="24"/>
+          <w:szCs w:val="24"/>
+          <w:vertAlign w:val="subscript"/>
+        </w:rPr>
+        <w:t xml:space="preserve">t</w:t>
+      </w:r>
+      <w:r>
+        <w:rPr>
+          <w:rFonts w:ascii="Times New Roman" w:cs="Times New Roman" w:eastAsia="Times New Roman" w:hAnsi="Times New Roman"/>
+          <w:sz w:val="24"/>
+          <w:szCs w:val="24"/>
+        </w:rPr>
+        <w:t xml:space="preserve"> (</w:t>
+      </w:r>
+      <w:r>
+        <w:rPr>
+          <w:rFonts w:ascii="Times New Roman" w:cs="Times New Roman" w:eastAsia="Times New Roman" w:hAnsi="Times New Roman"/>
+          <w:b/>
+          <w:bCs/>
+          <w:sz w:val="24"/>
+          <w:szCs w:val="24"/>
+        </w:rPr>
+        <w:t xml:space="preserve">trend</w:t>
+      </w:r>
+      <w:r>
+        <w:rPr>
+          <w:rFonts w:ascii="Times New Roman" w:cs="Times New Roman" w:eastAsia="Times New Roman" w:hAnsi="Times New Roman"/>
+          <w:sz w:val="24"/>
+          <w:szCs w:val="24"/>
+        </w:rPr>
+        <w:t xml:space="preserve">) is how much the level is rising per day; it is negative when sales are falling.</w:t>
+      </w:r>
+    </w:p>
+    <w:p>
+      <w:pPr>
+        <w:pStyle w:val="ListParagraph"/>
+        <w:numPr>
+          <w:ilvl w:val="0"/>
+          <w:numId w:val="5"/>
+        </w:numPr>
+        <w:spacing w:after="80" w:line="360"/>
+        <w:jc w:val="both"/>
+      </w:pPr>
+      <w:r>
+        <w:rPr>
+          <w:rFonts w:ascii="Times New Roman" w:cs="Times New Roman" w:eastAsia="Times New Roman" w:hAnsi="Times New Roman"/>
+          <w:i/>
+          <w:iCs/>
+          <w:sz w:val="24"/>
+          <w:szCs w:val="24"/>
+        </w:rPr>
+        <w:t xml:space="preserve">s</w:t>
+      </w:r>
+      <w:r>
+        <w:rPr>
+          <w:rFonts w:ascii="Times New Roman" w:cs="Times New Roman" w:eastAsia="Times New Roman" w:hAnsi="Times New Roman"/>
+          <w:i/>
+          <w:iCs/>
+          <w:sz w:val="24"/>
+          <w:szCs w:val="24"/>
+          <w:vertAlign w:val="subscript"/>
+        </w:rPr>
+        <w:t xml:space="preserve">t</w:t>
+      </w:r>
+      <w:r>
+        <w:rPr>
+          <w:rFonts w:ascii="Times New Roman" w:cs="Times New Roman" w:eastAsia="Times New Roman" w:hAnsi="Times New Roman"/>
+          <w:sz w:val="24"/>
+          <w:szCs w:val="24"/>
+        </w:rPr>
+        <w:t xml:space="preserve"> (</w:t>
+      </w:r>
+      <w:r>
+        <w:rPr>
+          <w:rFonts w:ascii="Times New Roman" w:cs="Times New Roman" w:eastAsia="Times New Roman" w:hAnsi="Times New Roman"/>
+          <w:b/>
+          <w:bCs/>
+          <w:sz w:val="24"/>
+          <w:szCs w:val="24"/>
+        </w:rPr>
+        <w:t xml:space="preserve">seasonal effect</w:t>
+      </w:r>
+      <w:r>
+        <w:rPr>
+          <w:rFonts w:ascii="Times New Roman" w:cs="Times New Roman" w:eastAsia="Times New Roman" w:hAnsi="Times New Roman"/>
+          <w:sz w:val="24"/>
+          <w:szCs w:val="24"/>
+        </w:rPr>
+        <w:t xml:space="preserve">) is how far above or below the level sales usually are on that day of the week, for example +6 units on a Saturday and −4 units on a Monday.</w:t>
+      </w:r>
+    </w:p>
+    <w:p>
+      <w:pPr>
+        <w:pStyle w:val="ListParagraph"/>
+        <w:numPr>
+          <w:ilvl w:val="0"/>
+          <w:numId w:val="5"/>
+        </w:numPr>
+        <w:spacing w:after="80" w:line="360"/>
+        <w:jc w:val="both"/>
+      </w:pPr>
+      <w:r>
+        <w:rPr>
+          <w:rFonts w:ascii="Times New Roman" w:cs="Times New Roman" w:eastAsia="Times New Roman" w:hAnsi="Times New Roman"/>
+          <w:i/>
+          <w:iCs/>
+          <w:sz w:val="24"/>
+          <w:szCs w:val="24"/>
+        </w:rPr>
+        <w:t xml:space="preserve">m</w:t>
+      </w:r>
+      <w:r>
+        <w:rPr>
+          <w:rFonts w:ascii="Times New Roman" w:cs="Times New Roman" w:eastAsia="Times New Roman" w:hAnsi="Times New Roman"/>
+          <w:sz w:val="24"/>
+          <w:szCs w:val="24"/>
+        </w:rPr>
+        <w:t xml:space="preserve"> = 7 is the length of the season in days (one week), so </w:t>
+      </w:r>
+      <w:r>
+        <w:rPr>
+          <w:rFonts w:ascii="Times New Roman" w:cs="Times New Roman" w:eastAsia="Times New Roman" w:hAnsi="Times New Roman"/>
+          <w:i/>
+          <w:iCs/>
+          <w:sz w:val="24"/>
+          <w:szCs w:val="24"/>
+        </w:rPr>
+        <w:t xml:space="preserve">s</w:t>
+      </w:r>
+      <w:r>
+        <w:rPr>
+          <w:rFonts w:ascii="Times New Roman" w:cs="Times New Roman" w:eastAsia="Times New Roman" w:hAnsi="Times New Roman"/>
+          <w:i/>
+          <w:iCs/>
+          <w:sz w:val="24"/>
+          <w:szCs w:val="24"/>
+          <w:vertAlign w:val="subscript"/>
+        </w:rPr>
+        <w:t xml:space="preserve">t−m</w:t>
+      </w:r>
+      <w:r>
+        <w:rPr>
+          <w:rFonts w:ascii="Times New Roman" w:cs="Times New Roman" w:eastAsia="Times New Roman" w:hAnsi="Times New Roman"/>
+          <w:sz w:val="24"/>
+          <w:szCs w:val="24"/>
+        </w:rPr>
+        <w:t xml:space="preserve"> is the seasonal effect of the same weekday one week earlier.</w:t>
+      </w:r>
+    </w:p>
+    <w:p>
+      <w:pPr>
+        <w:pStyle w:val="ListParagraph"/>
+        <w:numPr>
+          <w:ilvl w:val="0"/>
+          <w:numId w:val="5"/>
+        </w:numPr>
+        <w:spacing w:after="80" w:line="360"/>
+        <w:jc w:val="both"/>
+      </w:pPr>
+      <w:r>
+        <w:rPr>
+          <w:rFonts w:ascii="Times New Roman" w:cs="Times New Roman" w:eastAsia="Times New Roman" w:hAnsi="Times New Roman"/>
+          <w:i/>
+          <w:iCs/>
+          <w:sz w:val="24"/>
+          <w:szCs w:val="24"/>
+        </w:rPr>
+        <w:t xml:space="preserve">h</w:t>
+      </w:r>
+      <w:r>
+        <w:rPr>
+          <w:rFonts w:ascii="Times New Roman" w:cs="Times New Roman" w:eastAsia="Times New Roman" w:hAnsi="Times New Roman"/>
+          <w:sz w:val="24"/>
+          <w:szCs w:val="24"/>
+        </w:rPr>
+        <w:t xml:space="preserve"> is the number of days ahead being forecast, and </w:t>
+      </w:r>
+      <w:r>
+        <w:rPr>
+          <w:rFonts w:ascii="Times New Roman" w:cs="Times New Roman" w:eastAsia="Times New Roman" w:hAnsi="Times New Roman"/>
+          <w:i/>
+          <w:iCs/>
+          <w:sz w:val="24"/>
+          <w:szCs w:val="24"/>
+        </w:rPr>
+        <w:t xml:space="preserve">ŷ</w:t>
+      </w:r>
+      <w:r>
+        <w:rPr>
+          <w:rFonts w:ascii="Times New Roman" w:cs="Times New Roman" w:eastAsia="Times New Roman" w:hAnsi="Times New Roman"/>
+          <w:i/>
+          <w:iCs/>
+          <w:sz w:val="24"/>
+          <w:szCs w:val="24"/>
+          <w:vertAlign w:val="subscript"/>
+        </w:rPr>
+        <w:t xml:space="preserve">t+h</w:t>
+      </w:r>
+      <w:r>
+        <w:rPr>
+          <w:rFonts w:ascii="Times New Roman" w:cs="Times New Roman" w:eastAsia="Times New Roman" w:hAnsi="Times New Roman"/>
+          <w:sz w:val="24"/>
+          <w:szCs w:val="24"/>
+        </w:rPr>
+        <w:t xml:space="preserve"> is the forecast of the units that will be sold on day </w:t>
+      </w:r>
+      <w:r>
+        <w:rPr>
+          <w:rFonts w:ascii="Times New Roman" w:cs="Times New Roman" w:eastAsia="Times New Roman" w:hAnsi="Times New Roman"/>
+          <w:i/>
+          <w:iCs/>
+          <w:sz w:val="24"/>
+          <w:szCs w:val="24"/>
+        </w:rPr>
+        <w:t xml:space="preserve">t + h</w:t>
+      </w:r>
+      <w:r>
+        <w:rPr>
+          <w:rFonts w:ascii="Times New Roman" w:cs="Times New Roman" w:eastAsia="Times New Roman" w:hAnsi="Times New Roman"/>
+          <w:sz w:val="24"/>
+          <w:szCs w:val="24"/>
+        </w:rPr>
+        <w:t xml:space="preserve">.</w:t>
+      </w:r>
+    </w:p>
+    <w:p>
+      <w:pPr>
+        <w:pStyle w:val="ListParagraph"/>
+        <w:numPr>
+          <w:ilvl w:val="0"/>
+          <w:numId w:val="5"/>
+        </w:numPr>
+        <w:spacing w:after="80" w:line="360"/>
+        <w:jc w:val="both"/>
+      </w:pPr>
+      <w:r>
+        <w:rPr>
+          <w:rFonts w:ascii="Times New Roman" w:cs="Times New Roman" w:eastAsia="Times New Roman" w:hAnsi="Times New Roman"/>
+          <w:i/>
+          <w:iCs/>
+          <w:sz w:val="24"/>
+          <w:szCs w:val="24"/>
+        </w:rPr>
+        <w:t xml:space="preserve">α</w:t>
+      </w:r>
+      <w:r>
+        <w:rPr>
+          <w:rFonts w:ascii="Times New Roman" w:cs="Times New Roman" w:eastAsia="Times New Roman" w:hAnsi="Times New Roman"/>
+          <w:sz w:val="24"/>
+          <w:szCs w:val="24"/>
+        </w:rPr>
+        <w:t xml:space="preserve">, </w:t>
+      </w:r>
+      <w:r>
+        <w:rPr>
+          <w:rFonts w:ascii="Times New Roman" w:cs="Times New Roman" w:eastAsia="Times New Roman" w:hAnsi="Times New Roman"/>
+          <w:i/>
+          <w:iCs/>
+          <w:sz w:val="24"/>
+          <w:szCs w:val="24"/>
+        </w:rPr>
+        <w:t xml:space="preserve">β</w:t>
+      </w:r>
+      <w:r>
+        <w:rPr>
+          <w:rFonts w:ascii="Times New Roman" w:cs="Times New Roman" w:eastAsia="Times New Roman" w:hAnsi="Times New Roman"/>
+          <w:sz w:val="24"/>
+          <w:szCs w:val="24"/>
+        </w:rPr>
+        <w:t xml:space="preserve"> and </w:t>
+      </w:r>
+      <w:r>
+        <w:rPr>
+          <w:rFonts w:ascii="Times New Roman" w:cs="Times New Roman" w:eastAsia="Times New Roman" w:hAnsi="Times New Roman"/>
+          <w:i/>
+          <w:iCs/>
+          <w:sz w:val="24"/>
+          <w:szCs w:val="24"/>
+        </w:rPr>
+        <w:t xml:space="preserve">γ</w:t>
+      </w:r>
+      <w:r>
+        <w:rPr>
+          <w:rFonts w:ascii="Times New Roman" w:cs="Times New Roman" w:eastAsia="Times New Roman" w:hAnsi="Times New Roman"/>
+          <w:sz w:val="24"/>
+          <w:szCs w:val="24"/>
+        </w:rPr>
+        <w:t xml:space="preserve"> are smoothing constants between 0 and 1 for the level, the trend and the seasonal effect. A value close to 1 gives the newest day a lot of weight, so the estimate reacts quickly; a value close to 0 keeps the estimate steady.</w:t>
       </w:r>
     </w:p>
     <w:p>
@@ -7700,10 +8566,1135 @@
       <w:r>
         <w:rPr>
           <w:rFonts w:ascii="Times New Roman" w:cs="Times New Roman" w:eastAsia="Times New Roman" w:hAnsi="Times New Roman"/>
-          <w:sz w:val="24"/>
-          <w:szCs w:val="24"/>
-        </w:rPr>
-        <w:t xml:space="preserve">For products with too little history, a moving average is used instead. Festivals such as Diwali, Ganesh Chaturthi and Eid cause short, sharp increases in demand for certain goods; an uplift factor for each product is learned from its sales around past festivals and applied to known upcoming festival dates. Forecast accuracy is measured with the Mean Absolute Percentage Error, MAPE = (100/n) Σ |yₜ − ŷₜ| / yₜ, on a hold-out period.</w:t>
+          <w:b/>
+          <w:bCs/>
+          <w:sz w:val="24"/>
+          <w:szCs w:val="24"/>
+        </w:rPr>
+        <w:t xml:space="preserve">Equation (3.1)</w:t>
+      </w:r>
+      <w:r>
+        <w:rPr>
+          <w:rFonts w:ascii="Times New Roman" w:cs="Times New Roman" w:eastAsia="Times New Roman" w:hAnsi="Times New Roman"/>
+          <w:sz w:val="24"/>
+          <w:szCs w:val="24"/>
+        </w:rPr>
+        <w:t xml:space="preserve"> updates the level. The day's sales are first corrected for the day of the week by subtracting the usual effect of that weekday, </w:t>
+      </w:r>
+      <w:r>
+        <w:rPr>
+          <w:rFonts w:ascii="Times New Roman" w:cs="Times New Roman" w:eastAsia="Times New Roman" w:hAnsi="Times New Roman"/>
+          <w:i/>
+          <w:iCs/>
+          <w:sz w:val="24"/>
+          <w:szCs w:val="24"/>
+        </w:rPr>
+        <w:t xml:space="preserve">y</w:t>
+      </w:r>
+      <w:r>
+        <w:rPr>
+          <w:rFonts w:ascii="Times New Roman" w:cs="Times New Roman" w:eastAsia="Times New Roman" w:hAnsi="Times New Roman"/>
+          <w:i/>
+          <w:iCs/>
+          <w:sz w:val="24"/>
+          <w:szCs w:val="24"/>
+          <w:vertAlign w:val="subscript"/>
+        </w:rPr>
+        <w:t xml:space="preserve">t</w:t>
+      </w:r>
+      <w:r>
+        <w:rPr>
+          <w:rFonts w:ascii="Times New Roman" w:cs="Times New Roman" w:eastAsia="Times New Roman" w:hAnsi="Times New Roman"/>
+          <w:i/>
+          <w:iCs/>
+          <w:sz w:val="24"/>
+          <w:szCs w:val="24"/>
+        </w:rPr>
+        <w:t xml:space="preserve"> − s</w:t>
+      </w:r>
+      <w:r>
+        <w:rPr>
+          <w:rFonts w:ascii="Times New Roman" w:cs="Times New Roman" w:eastAsia="Times New Roman" w:hAnsi="Times New Roman"/>
+          <w:i/>
+          <w:iCs/>
+          <w:sz w:val="24"/>
+          <w:szCs w:val="24"/>
+          <w:vertAlign w:val="subscript"/>
+        </w:rPr>
+        <w:t xml:space="preserve">t−m</w:t>
+      </w:r>
+      <w:r>
+        <w:rPr>
+          <w:rFonts w:ascii="Times New Roman" w:cs="Times New Roman" w:eastAsia="Times New Roman" w:hAnsi="Times New Roman"/>
+          <w:sz w:val="24"/>
+          <w:szCs w:val="24"/>
+        </w:rPr>
+        <w:t xml:space="preserve">, so that a busy Saturday is not mistaken for a real rise in demand. This corrected value is then blended with what the previous level and trend expected for today, </w:t>
+      </w:r>
+      <w:r>
+        <w:rPr>
+          <w:rFonts w:ascii="Times New Roman" w:cs="Times New Roman" w:eastAsia="Times New Roman" w:hAnsi="Times New Roman"/>
+          <w:i/>
+          <w:iCs/>
+          <w:sz w:val="24"/>
+          <w:szCs w:val="24"/>
+        </w:rPr>
+        <w:t xml:space="preserve">ℓ</w:t>
+      </w:r>
+      <w:r>
+        <w:rPr>
+          <w:rFonts w:ascii="Times New Roman" w:cs="Times New Roman" w:eastAsia="Times New Roman" w:hAnsi="Times New Roman"/>
+          <w:i/>
+          <w:iCs/>
+          <w:sz w:val="24"/>
+          <w:szCs w:val="24"/>
+          <w:vertAlign w:val="subscript"/>
+        </w:rPr>
+        <w:t xml:space="preserve">t−1</w:t>
+      </w:r>
+      <w:r>
+        <w:rPr>
+          <w:rFonts w:ascii="Times New Roman" w:cs="Times New Roman" w:eastAsia="Times New Roman" w:hAnsi="Times New Roman"/>
+          <w:i/>
+          <w:iCs/>
+          <w:sz w:val="24"/>
+          <w:szCs w:val="24"/>
+        </w:rPr>
+        <w:t xml:space="preserve"> + b</w:t>
+      </w:r>
+      <w:r>
+        <w:rPr>
+          <w:rFonts w:ascii="Times New Roman" w:cs="Times New Roman" w:eastAsia="Times New Roman" w:hAnsi="Times New Roman"/>
+          <w:i/>
+          <w:iCs/>
+          <w:sz w:val="24"/>
+          <w:szCs w:val="24"/>
+          <w:vertAlign w:val="subscript"/>
+        </w:rPr>
+        <w:t xml:space="preserve">t−1</w:t>
+      </w:r>
+      <w:r>
+        <w:rPr>
+          <w:rFonts w:ascii="Times New Roman" w:cs="Times New Roman" w:eastAsia="Times New Roman" w:hAnsi="Times New Roman"/>
+          <w:sz w:val="24"/>
+          <w:szCs w:val="24"/>
+        </w:rPr>
+        <w:t xml:space="preserve">: a share </w:t>
+      </w:r>
+      <w:r>
+        <w:rPr>
+          <w:rFonts w:ascii="Times New Roman" w:cs="Times New Roman" w:eastAsia="Times New Roman" w:hAnsi="Times New Roman"/>
+          <w:i/>
+          <w:iCs/>
+          <w:sz w:val="24"/>
+          <w:szCs w:val="24"/>
+        </w:rPr>
+        <w:t xml:space="preserve">α</w:t>
+      </w:r>
+      <w:r>
+        <w:rPr>
+          <w:rFonts w:ascii="Times New Roman" w:cs="Times New Roman" w:eastAsia="Times New Roman" w:hAnsi="Times New Roman"/>
+          <w:sz w:val="24"/>
+          <w:szCs w:val="24"/>
+        </w:rPr>
+        <w:t xml:space="preserve"> comes from the new day and a share </w:t>
+      </w:r>
+      <w:r>
+        <w:rPr>
+          <w:rFonts w:ascii="Times New Roman" w:cs="Times New Roman" w:eastAsia="Times New Roman" w:hAnsi="Times New Roman"/>
+          <w:i/>
+          <w:iCs/>
+          <w:sz w:val="24"/>
+          <w:szCs w:val="24"/>
+        </w:rPr>
+        <w:t xml:space="preserve">1 − α</w:t>
+      </w:r>
+      <w:r>
+        <w:rPr>
+          <w:rFonts w:ascii="Times New Roman" w:cs="Times New Roman" w:eastAsia="Times New Roman" w:hAnsi="Times New Roman"/>
+          <w:sz w:val="24"/>
+          <w:szCs w:val="24"/>
+        </w:rPr>
+        <w:t xml:space="preserve"> from the earlier estimate.</w:t>
+      </w:r>
+    </w:p>
+    <w:p>
+      <w:pPr>
+        <w:spacing w:after="140" w:before="0" w:line="360"/>
+        <w:ind w:firstLine="720"/>
+        <w:jc w:val="both"/>
+      </w:pPr>
+      <w:r>
+        <w:rPr>
+          <w:rFonts w:ascii="Times New Roman" w:cs="Times New Roman" w:eastAsia="Times New Roman" w:hAnsi="Times New Roman"/>
+          <w:b/>
+          <w:bCs/>
+          <w:sz w:val="24"/>
+          <w:szCs w:val="24"/>
+        </w:rPr>
+        <w:t xml:space="preserve">Equation (3.2)</w:t>
+      </w:r>
+      <w:r>
+        <w:rPr>
+          <w:rFonts w:ascii="Times New Roman" w:cs="Times New Roman" w:eastAsia="Times New Roman" w:hAnsi="Times New Roman"/>
+          <w:sz w:val="24"/>
+          <w:szCs w:val="24"/>
+        </w:rPr>
+        <w:t xml:space="preserve"> updates the trend. The change in level from yesterday to today, </w:t>
+      </w:r>
+      <w:r>
+        <w:rPr>
+          <w:rFonts w:ascii="Times New Roman" w:cs="Times New Roman" w:eastAsia="Times New Roman" w:hAnsi="Times New Roman"/>
+          <w:i/>
+          <w:iCs/>
+          <w:sz w:val="24"/>
+          <w:szCs w:val="24"/>
+        </w:rPr>
+        <w:t xml:space="preserve">ℓ</w:t>
+      </w:r>
+      <w:r>
+        <w:rPr>
+          <w:rFonts w:ascii="Times New Roman" w:cs="Times New Roman" w:eastAsia="Times New Roman" w:hAnsi="Times New Roman"/>
+          <w:i/>
+          <w:iCs/>
+          <w:sz w:val="24"/>
+          <w:szCs w:val="24"/>
+          <w:vertAlign w:val="subscript"/>
+        </w:rPr>
+        <w:t xml:space="preserve">t</w:t>
+      </w:r>
+      <w:r>
+        <w:rPr>
+          <w:rFonts w:ascii="Times New Roman" w:cs="Times New Roman" w:eastAsia="Times New Roman" w:hAnsi="Times New Roman"/>
+          <w:i/>
+          <w:iCs/>
+          <w:sz w:val="24"/>
+          <w:szCs w:val="24"/>
+        </w:rPr>
+        <w:t xml:space="preserve"> − ℓ</w:t>
+      </w:r>
+      <w:r>
+        <w:rPr>
+          <w:rFonts w:ascii="Times New Roman" w:cs="Times New Roman" w:eastAsia="Times New Roman" w:hAnsi="Times New Roman"/>
+          <w:i/>
+          <w:iCs/>
+          <w:sz w:val="24"/>
+          <w:szCs w:val="24"/>
+          <w:vertAlign w:val="subscript"/>
+        </w:rPr>
+        <w:t xml:space="preserve">t−1</w:t>
+      </w:r>
+      <w:r>
+        <w:rPr>
+          <w:rFonts w:ascii="Times New Roman" w:cs="Times New Roman" w:eastAsia="Times New Roman" w:hAnsi="Times New Roman"/>
+          <w:sz w:val="24"/>
+          <w:szCs w:val="24"/>
+        </w:rPr>
+        <w:t xml:space="preserve">, is blended with the previous trend. With a small </w:t>
+      </w:r>
+      <w:r>
+        <w:rPr>
+          <w:rFonts w:ascii="Times New Roman" w:cs="Times New Roman" w:eastAsia="Times New Roman" w:hAnsi="Times New Roman"/>
+          <w:i/>
+          <w:iCs/>
+          <w:sz w:val="24"/>
+          <w:szCs w:val="24"/>
+        </w:rPr>
+        <w:t xml:space="preserve">β</w:t>
+      </w:r>
+      <w:r>
+        <w:rPr>
+          <w:rFonts w:ascii="Times New Roman" w:cs="Times New Roman" w:eastAsia="Times New Roman" w:hAnsi="Times New Roman"/>
+          <w:sz w:val="24"/>
+          <w:szCs w:val="24"/>
+        </w:rPr>
+        <w:t xml:space="preserve"> the trend changes only when sales keep rising or falling for some time, not because of one unusual day.</w:t>
+      </w:r>
+    </w:p>
+    <w:p>
+      <w:pPr>
+        <w:spacing w:after="140" w:before="0" w:line="360"/>
+        <w:ind w:firstLine="720"/>
+        <w:jc w:val="both"/>
+      </w:pPr>
+      <w:r>
+        <w:rPr>
+          <w:rFonts w:ascii="Times New Roman" w:cs="Times New Roman" w:eastAsia="Times New Roman" w:hAnsi="Times New Roman"/>
+          <w:b/>
+          <w:bCs/>
+          <w:sz w:val="24"/>
+          <w:szCs w:val="24"/>
+        </w:rPr>
+        <w:t xml:space="preserve">Equation (3.3)</w:t>
+      </w:r>
+      <w:r>
+        <w:rPr>
+          <w:rFonts w:ascii="Times New Roman" w:cs="Times New Roman" w:eastAsia="Times New Roman" w:hAnsi="Times New Roman"/>
+          <w:sz w:val="24"/>
+          <w:szCs w:val="24"/>
+        </w:rPr>
+        <w:t xml:space="preserve"> updates the seasonal effect of today's weekday. The difference between today's sales and the new level, </w:t>
+      </w:r>
+      <w:r>
+        <w:rPr>
+          <w:rFonts w:ascii="Times New Roman" w:cs="Times New Roman" w:eastAsia="Times New Roman" w:hAnsi="Times New Roman"/>
+          <w:i/>
+          <w:iCs/>
+          <w:sz w:val="24"/>
+          <w:szCs w:val="24"/>
+        </w:rPr>
+        <w:t xml:space="preserve">y</w:t>
+      </w:r>
+      <w:r>
+        <w:rPr>
+          <w:rFonts w:ascii="Times New Roman" w:cs="Times New Roman" w:eastAsia="Times New Roman" w:hAnsi="Times New Roman"/>
+          <w:i/>
+          <w:iCs/>
+          <w:sz w:val="24"/>
+          <w:szCs w:val="24"/>
+          <w:vertAlign w:val="subscript"/>
+        </w:rPr>
+        <w:t xml:space="preserve">t</w:t>
+      </w:r>
+      <w:r>
+        <w:rPr>
+          <w:rFonts w:ascii="Times New Roman" w:cs="Times New Roman" w:eastAsia="Times New Roman" w:hAnsi="Times New Roman"/>
+          <w:i/>
+          <w:iCs/>
+          <w:sz w:val="24"/>
+          <w:szCs w:val="24"/>
+        </w:rPr>
+        <w:t xml:space="preserve"> − ℓ</w:t>
+      </w:r>
+      <w:r>
+        <w:rPr>
+          <w:rFonts w:ascii="Times New Roman" w:cs="Times New Roman" w:eastAsia="Times New Roman" w:hAnsi="Times New Roman"/>
+          <w:i/>
+          <w:iCs/>
+          <w:sz w:val="24"/>
+          <w:szCs w:val="24"/>
+          <w:vertAlign w:val="subscript"/>
+        </w:rPr>
+        <w:t xml:space="preserve">t</w:t>
+      </w:r>
+      <w:r>
+        <w:rPr>
+          <w:rFonts w:ascii="Times New Roman" w:cs="Times New Roman" w:eastAsia="Times New Roman" w:hAnsi="Times New Roman"/>
+          <w:sz w:val="24"/>
+          <w:szCs w:val="24"/>
+        </w:rPr>
+        <w:t xml:space="preserve">, is blended with the effect the same weekday had a week ago. Each of the seven weekdays keeps its own seasonal effect, refreshed once a week.</w:t>
+      </w:r>
+    </w:p>
+    <w:p>
+      <w:pPr>
+        <w:spacing w:after="140" w:before="0" w:line="360"/>
+        <w:ind w:firstLine="720"/>
+        <w:jc w:val="both"/>
+      </w:pPr>
+      <w:r>
+        <w:rPr>
+          <w:rFonts w:ascii="Times New Roman" w:cs="Times New Roman" w:eastAsia="Times New Roman" w:hAnsi="Times New Roman"/>
+          <w:b/>
+          <w:bCs/>
+          <w:sz w:val="24"/>
+          <w:szCs w:val="24"/>
+        </w:rPr>
+        <w:t xml:space="preserve">Equation (3.4)</w:t>
+      </w:r>
+      <w:r>
+        <w:rPr>
+          <w:rFonts w:ascii="Times New Roman" w:cs="Times New Roman" w:eastAsia="Times New Roman" w:hAnsi="Times New Roman"/>
+          <w:sz w:val="24"/>
+          <w:szCs w:val="24"/>
+        </w:rPr>
+        <w:t xml:space="preserve"> makes the forecast. It starts from the current level, adds the trend once for each day ahead (</w:t>
+      </w:r>
+      <w:r>
+        <w:rPr>
+          <w:rFonts w:ascii="Times New Roman" w:cs="Times New Roman" w:eastAsia="Times New Roman" w:hAnsi="Times New Roman"/>
+          <w:i/>
+          <w:iCs/>
+          <w:sz w:val="24"/>
+          <w:szCs w:val="24"/>
+        </w:rPr>
+        <w:t xml:space="preserve">h · b</w:t>
+      </w:r>
+      <w:r>
+        <w:rPr>
+          <w:rFonts w:ascii="Times New Roman" w:cs="Times New Roman" w:eastAsia="Times New Roman" w:hAnsi="Times New Roman"/>
+          <w:i/>
+          <w:iCs/>
+          <w:sz w:val="24"/>
+          <w:szCs w:val="24"/>
+          <w:vertAlign w:val="subscript"/>
+        </w:rPr>
+        <w:t xml:space="preserve">t</w:t>
+      </w:r>
+      <w:r>
+        <w:rPr>
+          <w:rFonts w:ascii="Times New Roman" w:cs="Times New Roman" w:eastAsia="Times New Roman" w:hAnsi="Times New Roman"/>
+          <w:sz w:val="24"/>
+          <w:szCs w:val="24"/>
+        </w:rPr>
+        <w:t xml:space="preserve">) and adds the seasonal effect of the weekday being forecast, taken from the most recent week (</w:t>
+      </w:r>
+      <w:r>
+        <w:rPr>
+          <w:rFonts w:ascii="Times New Roman" w:cs="Times New Roman" w:eastAsia="Times New Roman" w:hAnsi="Times New Roman"/>
+          <w:i/>
+          <w:iCs/>
+          <w:sz w:val="24"/>
+          <w:szCs w:val="24"/>
+        </w:rPr>
+        <w:t xml:space="preserve">s</w:t>
+      </w:r>
+      <w:r>
+        <w:rPr>
+          <w:rFonts w:ascii="Times New Roman" w:cs="Times New Roman" w:eastAsia="Times New Roman" w:hAnsi="Times New Roman"/>
+          <w:i/>
+          <w:iCs/>
+          <w:sz w:val="24"/>
+          <w:szCs w:val="24"/>
+          <w:vertAlign w:val="subscript"/>
+        </w:rPr>
+        <w:t xml:space="preserve">t+h−m</w:t>
+      </w:r>
+      <w:r>
+        <w:rPr>
+          <w:rFonts w:ascii="Times New Roman" w:cs="Times New Roman" w:eastAsia="Times New Roman" w:hAnsi="Times New Roman"/>
+          <w:sz w:val="24"/>
+          <w:szCs w:val="24"/>
+        </w:rPr>
+        <w:t xml:space="preserve">). The demand expected during a supplier's lead time of </w:t>
+      </w:r>
+      <w:r>
+        <w:rPr>
+          <w:rFonts w:ascii="Times New Roman" w:cs="Times New Roman" w:eastAsia="Times New Roman" w:hAnsi="Times New Roman"/>
+          <w:i/>
+          <w:iCs/>
+          <w:sz w:val="24"/>
+          <w:szCs w:val="24"/>
+        </w:rPr>
+        <w:t xml:space="preserve">L</w:t>
+      </w:r>
+      <w:r>
+        <w:rPr>
+          <w:rFonts w:ascii="Times New Roman" w:cs="Times New Roman" w:eastAsia="Times New Roman" w:hAnsi="Times New Roman"/>
+          <w:sz w:val="24"/>
+          <w:szCs w:val="24"/>
+        </w:rPr>
+        <w:t xml:space="preserve"> days is the sum of the forecasts for </w:t>
+      </w:r>
+      <w:r>
+        <w:rPr>
+          <w:rFonts w:ascii="Times New Roman" w:cs="Times New Roman" w:eastAsia="Times New Roman" w:hAnsi="Times New Roman"/>
+          <w:i/>
+          <w:iCs/>
+          <w:sz w:val="24"/>
+          <w:szCs w:val="24"/>
+        </w:rPr>
+        <w:t xml:space="preserve">h</w:t>
+      </w:r>
+      <w:r>
+        <w:rPr>
+          <w:rFonts w:ascii="Times New Roman" w:cs="Times New Roman" w:eastAsia="Times New Roman" w:hAnsi="Times New Roman"/>
+          <w:sz w:val="24"/>
+          <w:szCs w:val="24"/>
+        </w:rPr>
+        <w:t xml:space="preserve"> = 1 to </w:t>
+      </w:r>
+      <w:r>
+        <w:rPr>
+          <w:rFonts w:ascii="Times New Roman" w:cs="Times New Roman" w:eastAsia="Times New Roman" w:hAnsi="Times New Roman"/>
+          <w:i/>
+          <w:iCs/>
+          <w:sz w:val="24"/>
+          <w:szCs w:val="24"/>
+        </w:rPr>
+        <w:t xml:space="preserve">L</w:t>
+      </w:r>
+      <w:r>
+        <w:rPr>
+          <w:rFonts w:ascii="Times New Roman" w:cs="Times New Roman" w:eastAsia="Times New Roman" w:hAnsi="Times New Roman"/>
+          <w:sz w:val="24"/>
+          <w:szCs w:val="24"/>
+        </w:rPr>
+        <w:t xml:space="preserve">.</w:t>
+      </w:r>
+    </w:p>
+    <w:p>
+      <w:pPr>
+        <w:spacing w:after="140" w:before="0" w:line="360"/>
+        <w:ind w:firstLine="720"/>
+        <w:jc w:val="both"/>
+      </w:pPr>
+      <w:r>
+        <w:rPr>
+          <w:rFonts w:ascii="Times New Roman" w:cs="Times New Roman" w:eastAsia="Times New Roman" w:hAnsi="Times New Roman"/>
+          <w:sz w:val="24"/>
+          <w:szCs w:val="24"/>
+        </w:rPr>
+        <w:t xml:space="preserve">The model is started from the first two weeks of sales: the starting level is the average daily sales of the first week, the starting trend is the difference between the averages of the two weeks divided by seven, and each weekday's starting seasonal effect is its sales in the first week minus that week's average. For each product, </w:t>
+      </w:r>
+      <w:r>
+        <w:rPr>
+          <w:rFonts w:ascii="Times New Roman" w:cs="Times New Roman" w:eastAsia="Times New Roman" w:hAnsi="Times New Roman"/>
+          <w:i/>
+          <w:iCs/>
+          <w:sz w:val="24"/>
+          <w:szCs w:val="24"/>
+        </w:rPr>
+        <w:t xml:space="preserve">α</w:t>
+      </w:r>
+      <w:r>
+        <w:rPr>
+          <w:rFonts w:ascii="Times New Roman" w:cs="Times New Roman" w:eastAsia="Times New Roman" w:hAnsi="Times New Roman"/>
+          <w:sz w:val="24"/>
+          <w:szCs w:val="24"/>
+        </w:rPr>
+        <w:t xml:space="preserve">, </w:t>
+      </w:r>
+      <w:r>
+        <w:rPr>
+          <w:rFonts w:ascii="Times New Roman" w:cs="Times New Roman" w:eastAsia="Times New Roman" w:hAnsi="Times New Roman"/>
+          <w:i/>
+          <w:iCs/>
+          <w:sz w:val="24"/>
+          <w:szCs w:val="24"/>
+        </w:rPr>
+        <w:t xml:space="preserve">β</w:t>
+      </w:r>
+      <w:r>
+        <w:rPr>
+          <w:rFonts w:ascii="Times New Roman" w:cs="Times New Roman" w:eastAsia="Times New Roman" w:hAnsi="Times New Roman"/>
+          <w:sz w:val="24"/>
+          <w:szCs w:val="24"/>
+        </w:rPr>
+        <w:t xml:space="preserve"> and </w:t>
+      </w:r>
+      <w:r>
+        <w:rPr>
+          <w:rFonts w:ascii="Times New Roman" w:cs="Times New Roman" w:eastAsia="Times New Roman" w:hAnsi="Times New Roman"/>
+          <w:i/>
+          <w:iCs/>
+          <w:sz w:val="24"/>
+          <w:szCs w:val="24"/>
+        </w:rPr>
+        <w:t xml:space="preserve">γ</w:t>
+      </w:r>
+      <w:r>
+        <w:rPr>
+          <w:rFonts w:ascii="Times New Roman" w:cs="Times New Roman" w:eastAsia="Times New Roman" w:hAnsi="Times New Roman"/>
+          <w:sz w:val="24"/>
+          <w:szCs w:val="24"/>
+        </w:rPr>
+        <w:t xml:space="preserve"> are chosen by trying values from 0.1 to 0.9 and keeping the combination that gives the smallest forecast error on its past sales.</w:t>
+      </w:r>
+    </w:p>
+    <w:p>
+      <w:pPr>
+        <w:spacing w:after="140" w:before="0" w:line="360"/>
+        <w:ind w:firstLine="720"/>
+        <w:jc w:val="both"/>
+      </w:pPr>
+      <w:r>
+        <w:rPr>
+          <w:rFonts w:ascii="Times New Roman" w:cs="Times New Roman" w:eastAsia="Times New Roman" w:hAnsi="Times New Roman"/>
+          <w:b/>
+          <w:bCs/>
+          <w:sz w:val="24"/>
+          <w:szCs w:val="24"/>
+        </w:rPr>
+        <w:t xml:space="preserve">Worked example.</w:t>
+      </w:r>
+      <w:r>
+        <w:rPr>
+          <w:rFonts w:ascii="Times New Roman" w:cs="Times New Roman" w:eastAsia="Times New Roman" w:hAnsi="Times New Roman"/>
+          <w:sz w:val="24"/>
+          <w:szCs w:val="24"/>
+        </w:rPr>
+        <w:t xml:space="preserve"> A packet of biscuits normally sells about 20 units a day. Yesterday's estimates were a level </w:t>
+      </w:r>
+      <w:r>
+        <w:rPr>
+          <w:rFonts w:ascii="Times New Roman" w:cs="Times New Roman" w:eastAsia="Times New Roman" w:hAnsi="Times New Roman"/>
+          <w:i/>
+          <w:iCs/>
+          <w:sz w:val="24"/>
+          <w:szCs w:val="24"/>
+        </w:rPr>
+        <w:t xml:space="preserve">ℓ</w:t>
+      </w:r>
+      <w:r>
+        <w:rPr>
+          <w:rFonts w:ascii="Times New Roman" w:cs="Times New Roman" w:eastAsia="Times New Roman" w:hAnsi="Times New Roman"/>
+          <w:i/>
+          <w:iCs/>
+          <w:sz w:val="24"/>
+          <w:szCs w:val="24"/>
+          <w:vertAlign w:val="subscript"/>
+        </w:rPr>
+        <w:t xml:space="preserve">t−1</w:t>
+      </w:r>
+      <w:r>
+        <w:rPr>
+          <w:rFonts w:ascii="Times New Roman" w:cs="Times New Roman" w:eastAsia="Times New Roman" w:hAnsi="Times New Roman"/>
+          <w:sz w:val="24"/>
+          <w:szCs w:val="24"/>
+        </w:rPr>
+        <w:t xml:space="preserve"> = 20 units and a trend </w:t>
+      </w:r>
+      <w:r>
+        <w:rPr>
+          <w:rFonts w:ascii="Times New Roman" w:cs="Times New Roman" w:eastAsia="Times New Roman" w:hAnsi="Times New Roman"/>
+          <w:i/>
+          <w:iCs/>
+          <w:sz w:val="24"/>
+          <w:szCs w:val="24"/>
+        </w:rPr>
+        <w:t xml:space="preserve">b</w:t>
+      </w:r>
+      <w:r>
+        <w:rPr>
+          <w:rFonts w:ascii="Times New Roman" w:cs="Times New Roman" w:eastAsia="Times New Roman" w:hAnsi="Times New Roman"/>
+          <w:i/>
+          <w:iCs/>
+          <w:sz w:val="24"/>
+          <w:szCs w:val="24"/>
+          <w:vertAlign w:val="subscript"/>
+        </w:rPr>
+        <w:t xml:space="preserve">t−1</w:t>
+      </w:r>
+      <w:r>
+        <w:rPr>
+          <w:rFonts w:ascii="Times New Roman" w:cs="Times New Roman" w:eastAsia="Times New Roman" w:hAnsi="Times New Roman"/>
+          <w:sz w:val="24"/>
+          <w:szCs w:val="24"/>
+        </w:rPr>
+        <w:t xml:space="preserve"> = 0.5 unit per day, and last Saturday's seasonal effect was </w:t>
+      </w:r>
+      <w:r>
+        <w:rPr>
+          <w:rFonts w:ascii="Times New Roman" w:cs="Times New Roman" w:eastAsia="Times New Roman" w:hAnsi="Times New Roman"/>
+          <w:i/>
+          <w:iCs/>
+          <w:sz w:val="24"/>
+          <w:szCs w:val="24"/>
+        </w:rPr>
+        <w:t xml:space="preserve">s</w:t>
+      </w:r>
+      <w:r>
+        <w:rPr>
+          <w:rFonts w:ascii="Times New Roman" w:cs="Times New Roman" w:eastAsia="Times New Roman" w:hAnsi="Times New Roman"/>
+          <w:i/>
+          <w:iCs/>
+          <w:sz w:val="24"/>
+          <w:szCs w:val="24"/>
+          <w:vertAlign w:val="subscript"/>
+        </w:rPr>
+        <w:t xml:space="preserve">t−7</w:t>
+      </w:r>
+      <w:r>
+        <w:rPr>
+          <w:rFonts w:ascii="Times New Roman" w:cs="Times New Roman" w:eastAsia="Times New Roman" w:hAnsi="Times New Roman"/>
+          <w:sz w:val="24"/>
+          <w:szCs w:val="24"/>
+        </w:rPr>
+        <w:t xml:space="preserve"> = +6 units. Today is a Saturday and 28 packets were sold. With </w:t>
+      </w:r>
+      <w:r>
+        <w:rPr>
+          <w:rFonts w:ascii="Times New Roman" w:cs="Times New Roman" w:eastAsia="Times New Roman" w:hAnsi="Times New Roman"/>
+          <w:i/>
+          <w:iCs/>
+          <w:sz w:val="24"/>
+          <w:szCs w:val="24"/>
+        </w:rPr>
+        <w:t xml:space="preserve">α</w:t>
+      </w:r>
+      <w:r>
+        <w:rPr>
+          <w:rFonts w:ascii="Times New Roman" w:cs="Times New Roman" w:eastAsia="Times New Roman" w:hAnsi="Times New Roman"/>
+          <w:sz w:val="24"/>
+          <w:szCs w:val="24"/>
+        </w:rPr>
+        <w:t xml:space="preserve"> = 0.3, </w:t>
+      </w:r>
+      <w:r>
+        <w:rPr>
+          <w:rFonts w:ascii="Times New Roman" w:cs="Times New Roman" w:eastAsia="Times New Roman" w:hAnsi="Times New Roman"/>
+          <w:i/>
+          <w:iCs/>
+          <w:sz w:val="24"/>
+          <w:szCs w:val="24"/>
+        </w:rPr>
+        <w:t xml:space="preserve">β</w:t>
+      </w:r>
+      <w:r>
+        <w:rPr>
+          <w:rFonts w:ascii="Times New Roman" w:cs="Times New Roman" w:eastAsia="Times New Roman" w:hAnsi="Times New Roman"/>
+          <w:sz w:val="24"/>
+          <w:szCs w:val="24"/>
+        </w:rPr>
+        <w:t xml:space="preserve"> = 0.1 and </w:t>
+      </w:r>
+      <w:r>
+        <w:rPr>
+          <w:rFonts w:ascii="Times New Roman" w:cs="Times New Roman" w:eastAsia="Times New Roman" w:hAnsi="Times New Roman"/>
+          <w:i/>
+          <w:iCs/>
+          <w:sz w:val="24"/>
+          <w:szCs w:val="24"/>
+        </w:rPr>
+        <w:t xml:space="preserve">γ</w:t>
+      </w:r>
+      <w:r>
+        <w:rPr>
+          <w:rFonts w:ascii="Times New Roman" w:cs="Times New Roman" w:eastAsia="Times New Roman" w:hAnsi="Times New Roman"/>
+          <w:sz w:val="24"/>
+          <w:szCs w:val="24"/>
+        </w:rPr>
+        <w:t xml:space="preserve"> = 0.2:</w:t>
+      </w:r>
+    </w:p>
+    <w:p>
+      <w:pPr>
+        <w:pStyle w:val="ListParagraph"/>
+        <w:numPr>
+          <w:ilvl w:val="0"/>
+          <w:numId w:val="6"/>
+        </w:numPr>
+        <w:spacing w:after="80" w:line="360"/>
+        <w:jc w:val="both"/>
+      </w:pPr>
+      <w:r>
+        <w:rPr>
+          <w:rFonts w:ascii="Times New Roman" w:cs="Times New Roman" w:eastAsia="Times New Roman" w:hAnsi="Times New Roman"/>
+          <w:sz w:val="24"/>
+          <w:szCs w:val="24"/>
+        </w:rPr>
+        <w:t xml:space="preserve">Level (3.1): </w:t>
+      </w:r>
+      <w:r>
+        <w:rPr>
+          <w:rFonts w:ascii="Times New Roman" w:cs="Times New Roman" w:eastAsia="Times New Roman" w:hAnsi="Times New Roman"/>
+          <w:i/>
+          <w:iCs/>
+          <w:sz w:val="24"/>
+          <w:szCs w:val="24"/>
+        </w:rPr>
+        <w:t xml:space="preserve">ℓ</w:t>
+      </w:r>
+      <w:r>
+        <w:rPr>
+          <w:rFonts w:ascii="Times New Roman" w:cs="Times New Roman" w:eastAsia="Times New Roman" w:hAnsi="Times New Roman"/>
+          <w:i/>
+          <w:iCs/>
+          <w:sz w:val="24"/>
+          <w:szCs w:val="24"/>
+          <w:vertAlign w:val="subscript"/>
+        </w:rPr>
+        <w:t xml:space="preserve">t</w:t>
+      </w:r>
+      <w:r>
+        <w:rPr>
+          <w:rFonts w:ascii="Times New Roman" w:cs="Times New Roman" w:eastAsia="Times New Roman" w:hAnsi="Times New Roman"/>
+          <w:sz w:val="24"/>
+          <w:szCs w:val="24"/>
+        </w:rPr>
+        <w:t xml:space="preserve"> = 0.3 × (28 − 6) + 0.7 × (20 + 0.5) = 6.6 + 14.35 = </w:t>
+      </w:r>
+      <w:r>
+        <w:rPr>
+          <w:rFonts w:ascii="Times New Roman" w:cs="Times New Roman" w:eastAsia="Times New Roman" w:hAnsi="Times New Roman"/>
+          <w:b/>
+          <w:bCs/>
+          <w:sz w:val="24"/>
+          <w:szCs w:val="24"/>
+        </w:rPr>
+        <w:t xml:space="preserve">20.95</w:t>
+      </w:r>
+      <w:r>
+        <w:rPr>
+          <w:rFonts w:ascii="Times New Roman" w:cs="Times New Roman" w:eastAsia="Times New Roman" w:hAnsi="Times New Roman"/>
+          <w:sz w:val="24"/>
+          <w:szCs w:val="24"/>
+        </w:rPr>
+        <w:t xml:space="preserve"> units.</w:t>
+      </w:r>
+    </w:p>
+    <w:p>
+      <w:pPr>
+        <w:pStyle w:val="ListParagraph"/>
+        <w:numPr>
+          <w:ilvl w:val="0"/>
+          <w:numId w:val="6"/>
+        </w:numPr>
+        <w:spacing w:after="80" w:line="360"/>
+        <w:jc w:val="both"/>
+      </w:pPr>
+      <w:r>
+        <w:rPr>
+          <w:rFonts w:ascii="Times New Roman" w:cs="Times New Roman" w:eastAsia="Times New Roman" w:hAnsi="Times New Roman"/>
+          <w:sz w:val="24"/>
+          <w:szCs w:val="24"/>
+        </w:rPr>
+        <w:t xml:space="preserve">Trend (3.2): </w:t>
+      </w:r>
+      <w:r>
+        <w:rPr>
+          <w:rFonts w:ascii="Times New Roman" w:cs="Times New Roman" w:eastAsia="Times New Roman" w:hAnsi="Times New Roman"/>
+          <w:i/>
+          <w:iCs/>
+          <w:sz w:val="24"/>
+          <w:szCs w:val="24"/>
+        </w:rPr>
+        <w:t xml:space="preserve">b</w:t>
+      </w:r>
+      <w:r>
+        <w:rPr>
+          <w:rFonts w:ascii="Times New Roman" w:cs="Times New Roman" w:eastAsia="Times New Roman" w:hAnsi="Times New Roman"/>
+          <w:i/>
+          <w:iCs/>
+          <w:sz w:val="24"/>
+          <w:szCs w:val="24"/>
+          <w:vertAlign w:val="subscript"/>
+        </w:rPr>
+        <w:t xml:space="preserve">t</w:t>
+      </w:r>
+      <w:r>
+        <w:rPr>
+          <w:rFonts w:ascii="Times New Roman" w:cs="Times New Roman" w:eastAsia="Times New Roman" w:hAnsi="Times New Roman"/>
+          <w:sz w:val="24"/>
+          <w:szCs w:val="24"/>
+        </w:rPr>
+        <w:t xml:space="preserve"> = 0.1 × (20.95 − 20) + 0.9 × 0.5 = 0.095 + 0.45 = </w:t>
+      </w:r>
+      <w:r>
+        <w:rPr>
+          <w:rFonts w:ascii="Times New Roman" w:cs="Times New Roman" w:eastAsia="Times New Roman" w:hAnsi="Times New Roman"/>
+          <w:b/>
+          <w:bCs/>
+          <w:sz w:val="24"/>
+          <w:szCs w:val="24"/>
+        </w:rPr>
+        <w:t xml:space="preserve">0.545</w:t>
+      </w:r>
+      <w:r>
+        <w:rPr>
+          <w:rFonts w:ascii="Times New Roman" w:cs="Times New Roman" w:eastAsia="Times New Roman" w:hAnsi="Times New Roman"/>
+          <w:sz w:val="24"/>
+          <w:szCs w:val="24"/>
+        </w:rPr>
+        <w:t xml:space="preserve"> unit per day.</w:t>
+      </w:r>
+    </w:p>
+    <w:p>
+      <w:pPr>
+        <w:pStyle w:val="ListParagraph"/>
+        <w:numPr>
+          <w:ilvl w:val="0"/>
+          <w:numId w:val="6"/>
+        </w:numPr>
+        <w:spacing w:after="80" w:line="360"/>
+        <w:jc w:val="both"/>
+      </w:pPr>
+      <w:r>
+        <w:rPr>
+          <w:rFonts w:ascii="Times New Roman" w:cs="Times New Roman" w:eastAsia="Times New Roman" w:hAnsi="Times New Roman"/>
+          <w:sz w:val="24"/>
+          <w:szCs w:val="24"/>
+        </w:rPr>
+        <w:t xml:space="preserve">Seasonal effect (3.3): </w:t>
+      </w:r>
+      <w:r>
+        <w:rPr>
+          <w:rFonts w:ascii="Times New Roman" w:cs="Times New Roman" w:eastAsia="Times New Roman" w:hAnsi="Times New Roman"/>
+          <w:i/>
+          <w:iCs/>
+          <w:sz w:val="24"/>
+          <w:szCs w:val="24"/>
+        </w:rPr>
+        <w:t xml:space="preserve">s</w:t>
+      </w:r>
+      <w:r>
+        <w:rPr>
+          <w:rFonts w:ascii="Times New Roman" w:cs="Times New Roman" w:eastAsia="Times New Roman" w:hAnsi="Times New Roman"/>
+          <w:i/>
+          <w:iCs/>
+          <w:sz w:val="24"/>
+          <w:szCs w:val="24"/>
+          <w:vertAlign w:val="subscript"/>
+        </w:rPr>
+        <w:t xml:space="preserve">t</w:t>
+      </w:r>
+      <w:r>
+        <w:rPr>
+          <w:rFonts w:ascii="Times New Roman" w:cs="Times New Roman" w:eastAsia="Times New Roman" w:hAnsi="Times New Roman"/>
+          <w:sz w:val="24"/>
+          <w:szCs w:val="24"/>
+        </w:rPr>
+        <w:t xml:space="preserve"> = 0.2 × (28 − 20.95) + 0.8 × 6 = 1.41 + 4.8 = </w:t>
+      </w:r>
+      <w:r>
+        <w:rPr>
+          <w:rFonts w:ascii="Times New Roman" w:cs="Times New Roman" w:eastAsia="Times New Roman" w:hAnsi="Times New Roman"/>
+          <w:b/>
+          <w:bCs/>
+          <w:sz w:val="24"/>
+          <w:szCs w:val="24"/>
+        </w:rPr>
+        <w:t xml:space="preserve">6.21</w:t>
+      </w:r>
+      <w:r>
+        <w:rPr>
+          <w:rFonts w:ascii="Times New Roman" w:cs="Times New Roman" w:eastAsia="Times New Roman" w:hAnsi="Times New Roman"/>
+          <w:sz w:val="24"/>
+          <w:szCs w:val="24"/>
+        </w:rPr>
+        <w:t xml:space="preserve"> units.</w:t>
+      </w:r>
+    </w:p>
+    <w:p>
+      <w:pPr>
+        <w:pStyle w:val="ListParagraph"/>
+        <w:numPr>
+          <w:ilvl w:val="0"/>
+          <w:numId w:val="6"/>
+        </w:numPr>
+        <w:spacing w:after="80" w:line="360"/>
+        <w:jc w:val="both"/>
+      </w:pPr>
+      <w:r>
+        <w:rPr>
+          <w:rFonts w:ascii="Times New Roman" w:cs="Times New Roman" w:eastAsia="Times New Roman" w:hAnsi="Times New Roman"/>
+          <w:sz w:val="24"/>
+          <w:szCs w:val="24"/>
+        </w:rPr>
+        <w:t xml:space="preserve">Forecast for next Saturday (3.4), with </w:t>
+      </w:r>
+      <w:r>
+        <w:rPr>
+          <w:rFonts w:ascii="Times New Roman" w:cs="Times New Roman" w:eastAsia="Times New Roman" w:hAnsi="Times New Roman"/>
+          <w:i/>
+          <w:iCs/>
+          <w:sz w:val="24"/>
+          <w:szCs w:val="24"/>
+        </w:rPr>
+        <w:t xml:space="preserve">h</w:t>
+      </w:r>
+      <w:r>
+        <w:rPr>
+          <w:rFonts w:ascii="Times New Roman" w:cs="Times New Roman" w:eastAsia="Times New Roman" w:hAnsi="Times New Roman"/>
+          <w:sz w:val="24"/>
+          <w:szCs w:val="24"/>
+        </w:rPr>
+        <w:t xml:space="preserve"> = 7 so that </w:t>
+      </w:r>
+      <w:r>
+        <w:rPr>
+          <w:rFonts w:ascii="Times New Roman" w:cs="Times New Roman" w:eastAsia="Times New Roman" w:hAnsi="Times New Roman"/>
+          <w:i/>
+          <w:iCs/>
+          <w:sz w:val="24"/>
+          <w:szCs w:val="24"/>
+        </w:rPr>
+        <w:t xml:space="preserve">s</w:t>
+      </w:r>
+      <w:r>
+        <w:rPr>
+          <w:rFonts w:ascii="Times New Roman" w:cs="Times New Roman" w:eastAsia="Times New Roman" w:hAnsi="Times New Roman"/>
+          <w:i/>
+          <w:iCs/>
+          <w:sz w:val="24"/>
+          <w:szCs w:val="24"/>
+          <w:vertAlign w:val="subscript"/>
+        </w:rPr>
+        <w:t xml:space="preserve">t+h−m</w:t>
+      </w:r>
+      <w:r>
+        <w:rPr>
+          <w:rFonts w:ascii="Times New Roman" w:cs="Times New Roman" w:eastAsia="Times New Roman" w:hAnsi="Times New Roman"/>
+          <w:sz w:val="24"/>
+          <w:szCs w:val="24"/>
+        </w:rPr>
+        <w:t xml:space="preserve"> = </w:t>
+      </w:r>
+      <w:r>
+        <w:rPr>
+          <w:rFonts w:ascii="Times New Roman" w:cs="Times New Roman" w:eastAsia="Times New Roman" w:hAnsi="Times New Roman"/>
+          <w:i/>
+          <w:iCs/>
+          <w:sz w:val="24"/>
+          <w:szCs w:val="24"/>
+        </w:rPr>
+        <w:t xml:space="preserve">s</w:t>
+      </w:r>
+      <w:r>
+        <w:rPr>
+          <w:rFonts w:ascii="Times New Roman" w:cs="Times New Roman" w:eastAsia="Times New Roman" w:hAnsi="Times New Roman"/>
+          <w:i/>
+          <w:iCs/>
+          <w:sz w:val="24"/>
+          <w:szCs w:val="24"/>
+          <w:vertAlign w:val="subscript"/>
+        </w:rPr>
+        <w:t xml:space="preserve">t</w:t>
+      </w:r>
+      <w:r>
+        <w:rPr>
+          <w:rFonts w:ascii="Times New Roman" w:cs="Times New Roman" w:eastAsia="Times New Roman" w:hAnsi="Times New Roman"/>
+          <w:sz w:val="24"/>
+          <w:szCs w:val="24"/>
+        </w:rPr>
+        <w:t xml:space="preserve">: </w:t>
+      </w:r>
+      <w:r>
+        <w:rPr>
+          <w:rFonts w:ascii="Times New Roman" w:cs="Times New Roman" w:eastAsia="Times New Roman" w:hAnsi="Times New Roman"/>
+          <w:i/>
+          <w:iCs/>
+          <w:sz w:val="24"/>
+          <w:szCs w:val="24"/>
+        </w:rPr>
+        <w:t xml:space="preserve">ŷ</w:t>
+      </w:r>
+      <w:r>
+        <w:rPr>
+          <w:rFonts w:ascii="Times New Roman" w:cs="Times New Roman" w:eastAsia="Times New Roman" w:hAnsi="Times New Roman"/>
+          <w:i/>
+          <w:iCs/>
+          <w:sz w:val="24"/>
+          <w:szCs w:val="24"/>
+          <w:vertAlign w:val="subscript"/>
+        </w:rPr>
+        <w:t xml:space="preserve">t+7</w:t>
+      </w:r>
+      <w:r>
+        <w:rPr>
+          <w:rFonts w:ascii="Times New Roman" w:cs="Times New Roman" w:eastAsia="Times New Roman" w:hAnsi="Times New Roman"/>
+          <w:sz w:val="24"/>
+          <w:szCs w:val="24"/>
+        </w:rPr>
+        <w:t xml:space="preserve"> = 20.95 + 7 × 0.545 + 6.21 = 30.975, that is about </w:t>
+      </w:r>
+      <w:r>
+        <w:rPr>
+          <w:rFonts w:ascii="Times New Roman" w:cs="Times New Roman" w:eastAsia="Times New Roman" w:hAnsi="Times New Roman"/>
+          <w:b/>
+          <w:bCs/>
+          <w:sz w:val="24"/>
+          <w:szCs w:val="24"/>
+        </w:rPr>
+        <w:t xml:space="preserve">31 packets</w:t>
+      </w:r>
+      <w:r>
+        <w:rPr>
+          <w:rFonts w:ascii="Times New Roman" w:cs="Times New Roman" w:eastAsia="Times New Roman" w:hAnsi="Times New Roman"/>
+          <w:sz w:val="24"/>
+          <w:szCs w:val="24"/>
+        </w:rPr>
+        <w:t xml:space="preserve">.</w:t>
+      </w:r>
+    </w:p>
+    <w:p>
+      <w:pPr>
+        <w:spacing w:after="140" w:before="0" w:line="360"/>
+        <w:ind w:firstLine="720"/>
+        <w:jc w:val="both"/>
+      </w:pPr>
+      <w:r>
+        <w:rPr>
+          <w:rFonts w:ascii="Times New Roman" w:cs="Times New Roman" w:eastAsia="Times New Roman" w:hAnsi="Times New Roman"/>
+          <w:sz w:val="24"/>
+          <w:szCs w:val="24"/>
+        </w:rPr>
+        <w:t xml:space="preserve">The system therefore expects about 31 packets to sell next Saturday: more than on an ordinary day because Saturdays are busy, and slightly more than this Saturday because sales are growing.</w:t>
+      </w:r>
+    </w:p>
+    <w:p>
+      <w:pPr>
+        <w:spacing w:after="140" w:before="0" w:line="360"/>
+        <w:ind w:firstLine="720"/>
+        <w:jc w:val="both"/>
+      </w:pPr>
+      <w:r>
+        <w:rPr>
+          <w:rFonts w:ascii="Times New Roman" w:cs="Times New Roman" w:eastAsia="Times New Roman" w:hAnsi="Times New Roman"/>
+          <w:sz w:val="24"/>
+          <w:szCs w:val="24"/>
+        </w:rPr>
+        <w:t xml:space="preserve">For products with too little history, a moving average is used instead. Festivals such as Diwali, Ganesh Chaturthi and Eid cause short, sharp increases in demand for certain goods; an uplift factor for each product is learned from its sales around past festivals and applied to known upcoming festival dates. Forecast accuracy is measured with the Mean Absolute Percentage Error, MAPE = (100/n) Σ |y</w:t>
+      </w:r>
+      <w:r>
+        <w:rPr>
+          <w:rFonts w:ascii="Times New Roman" w:cs="Times New Roman" w:eastAsia="Times New Roman" w:hAnsi="Times New Roman"/>
+          <w:sz w:val="24"/>
+          <w:szCs w:val="24"/>
+          <w:vertAlign w:val="subscript"/>
+        </w:rPr>
+        <w:t xml:space="preserve">t</w:t>
+      </w:r>
+      <w:r>
+        <w:rPr>
+          <w:rFonts w:ascii="Times New Roman" w:cs="Times New Roman" w:eastAsia="Times New Roman" w:hAnsi="Times New Roman"/>
+          <w:sz w:val="24"/>
+          <w:szCs w:val="24"/>
+        </w:rPr>
+        <w:t xml:space="preserve"> − ŷ</w:t>
+      </w:r>
+      <w:r>
+        <w:rPr>
+          <w:rFonts w:ascii="Times New Roman" w:cs="Times New Roman" w:eastAsia="Times New Roman" w:hAnsi="Times New Roman"/>
+          <w:sz w:val="24"/>
+          <w:szCs w:val="24"/>
+          <w:vertAlign w:val="subscript"/>
+        </w:rPr>
+        <w:t xml:space="preserve">t</w:t>
+      </w:r>
+      <w:r>
+        <w:rPr>
+          <w:rFonts w:ascii="Times New Roman" w:cs="Times New Roman" w:eastAsia="Times New Roman" w:hAnsi="Times New Roman"/>
+          <w:sz w:val="24"/>
+          <w:szCs w:val="24"/>
+        </w:rPr>
+        <w:t xml:space="preserve">| / y</w:t>
+      </w:r>
+      <w:r>
+        <w:rPr>
+          <w:rFonts w:ascii="Times New Roman" w:cs="Times New Roman" w:eastAsia="Times New Roman" w:hAnsi="Times New Roman"/>
+          <w:sz w:val="24"/>
+          <w:szCs w:val="24"/>
+          <w:vertAlign w:val="subscript"/>
+        </w:rPr>
+        <w:t xml:space="preserve">t</w:t>
+      </w:r>
+      <w:r>
+        <w:rPr>
+          <w:rFonts w:ascii="Times New Roman" w:cs="Times New Roman" w:eastAsia="Times New Roman" w:hAnsi="Times New Roman"/>
+          <w:sz w:val="24"/>
+          <w:szCs w:val="24"/>
+        </w:rPr>
+        <w:t xml:space="preserve">, over </w:t>
+      </w:r>
+      <w:r>
+        <w:rPr>
+          <w:rFonts w:ascii="Times New Roman" w:cs="Times New Roman" w:eastAsia="Times New Roman" w:hAnsi="Times New Roman"/>
+          <w:i/>
+          <w:iCs/>
+          <w:sz w:val="24"/>
+          <w:szCs w:val="24"/>
+        </w:rPr>
+        <w:t xml:space="preserve">n</w:t>
+      </w:r>
+      <w:r>
+        <w:rPr>
+          <w:rFonts w:ascii="Times New Roman" w:cs="Times New Roman" w:eastAsia="Times New Roman" w:hAnsi="Times New Roman"/>
+          <w:sz w:val="24"/>
+          <w:szCs w:val="24"/>
+        </w:rPr>
+        <w:t xml:space="preserve"> days kept aside from the fitting (a hold-out period); for example, a MAPE of 15% means the forecasts were off by 15% on average.</w:t>
       </w:r>
     </w:p>
     <w:p>
@@ -8361,6 +10352,18 @@
   </w:num>
   <w:num w:numId="4">
     <w:abstractNumId w:val="2"/>
+    <w:lvlOverride w:ilvl="0">
+      <w:startOverride w:val="1"/>
+    </w:lvlOverride>
+  </w:num>
+  <w:num w:numId="5">
+    <w:abstractNumId w:val="3"/>
+    <w:lvlOverride w:ilvl="0">
+      <w:startOverride w:val="1"/>
+    </w:lvlOverride>
+  </w:num>
+  <w:num w:numId="6">
+    <w:abstractNumId w:val="3"/>
     <w:lvlOverride w:ilvl="0">
       <w:startOverride w:val="1"/>
     </w:lvlOverride>

</xml_diff>